<commit_message>
Update Blog-Should You Really Buy Bitcoin the Same Way Every Day?.docx
</commit_message>
<xml_diff>
--- a/final report/Blog-Should You Really Buy Bitcoin the Same Way Every Day?.docx
+++ b/final report/Blog-Should You Really Buy Bitcoin the Same Way Every Day?.docx
@@ -87,7 +87,7 @@
       <w:pPr>
         <w:pStyle w:val="ac"/>
         <w:rPr>
-          <w:rFonts w:ascii="Times New Roman" w:hAnsi="Times New Roman" w:cs="Times New Roman"/>
+          <w:rFonts w:ascii="Times New Roman" w:hAnsi="Times New Roman" w:cs="Times New Roman" w:hint="eastAsia"/>
         </w:rPr>
       </w:pPr>
       <w:r>
@@ -120,6 +120,61 @@
     </w:p>
     <w:p>
       <w:pPr>
+        <w:pStyle w:val="2"/>
+        <w:rPr>
+          <w:rFonts w:ascii="Times New Roman" w:hAnsi="Times New Roman" w:cs="Times New Roman"/>
+        </w:rPr>
+      </w:pPr>
+      <w:r>
+        <w:rPr>
+          <w:rFonts w:ascii="Times New Roman" w:hAnsi="Times New Roman" w:cs="Times New Roman"/>
+        </w:rPr>
+        <w:t>What matters is not “perfect prediction,” but smarter filtering</w:t>
+      </w:r>
+    </w:p>
+    <w:p>
+      <w:pPr>
+        <w:pStyle w:val="ac"/>
+        <w:rPr>
+          <w:rFonts w:ascii="Times New Roman" w:hAnsi="Times New Roman" w:cs="Times New Roman"/>
+        </w:rPr>
+      </w:pPr>
+      <w:r>
+        <w:rPr>
+          <w:rFonts w:ascii="Times New Roman" w:hAnsi="Times New Roman" w:cs="Times New Roman"/>
+        </w:rPr>
+        <w:t>No model can reliably tell you where Bitcoin goes tomorrow. But that does not mean every day is equally attractive for accumulation. The real value, we found, lies in identifying which market environments offer better windows for long-term buying.</w:t>
+      </w:r>
+      <w:r>
+        <w:rPr>
+          <w:rFonts w:ascii="Times New Roman" w:hAnsi="Times New Roman" w:cs="Times New Roman" w:hint="eastAsia"/>
+        </w:rPr>
+        <w:t xml:space="preserve"> </w:t>
+      </w:r>
+      <w:r>
+        <w:rPr>
+          <w:rFonts w:ascii="Times New Roman" w:hAnsi="Times New Roman" w:cs="Times New Roman"/>
+        </w:rPr>
+        <w:t>From our analysis, four signal groups stood out.</w:t>
+      </w:r>
+    </w:p>
+    <w:p>
+      <w:pPr>
+        <w:pStyle w:val="3"/>
+        <w:rPr>
+          <w:rFonts w:ascii="Times New Roman" w:hAnsi="Times New Roman" w:cs="Times New Roman"/>
+        </w:rPr>
+      </w:pPr>
+      <w:r>
+        <w:rPr>
+          <w:rFonts w:ascii="Times New Roman" w:hAnsi="Times New Roman" w:cs="Times New Roman"/>
+        </w:rPr>
+        <w:t>1) The strongest signal is still on-chain: undervaluation plus participation</w:t>
+      </w:r>
+    </w:p>
+    <w:p>
+      <w:pPr>
+        <w:pStyle w:val="ac"/>
         <w:rPr>
           <w:rFonts w:ascii="Times New Roman" w:hAnsi="Times New Roman" w:cs="Times New Roman"/>
         </w:rPr>
@@ -129,81 +184,10 @@
           <w:rFonts w:ascii="Times New Roman" w:hAnsi="Times New Roman" w:cs="Times New Roman"/>
           <w:noProof/>
         </w:rPr>
-        <w:pict w14:anchorId="1C679AE6">
-          <v:rect id="_x0000_i1028" alt="" style="width:415.3pt;height:.05pt;mso-width-percent:0;mso-height-percent:0;mso-width-percent:0;mso-height-percent:0" o:hralign="center" o:hrstd="t" o:hr="t" fillcolor="#a0a0a0" stroked="f"/>
-        </w:pict>
-      </w:r>
-    </w:p>
-    <w:p>
-      <w:pPr>
-        <w:pStyle w:val="2"/>
-        <w:rPr>
-          <w:rFonts w:ascii="Times New Roman" w:hAnsi="Times New Roman" w:cs="Times New Roman"/>
-        </w:rPr>
-      </w:pPr>
-      <w:r>
-        <w:rPr>
-          <w:rFonts w:ascii="Times New Roman" w:hAnsi="Times New Roman" w:cs="Times New Roman"/>
-        </w:rPr>
-        <w:t>What matters is not “perfect prediction,” but smarter filtering</w:t>
-      </w:r>
-    </w:p>
-    <w:p>
-      <w:pPr>
-        <w:pStyle w:val="ac"/>
-        <w:rPr>
-          <w:rFonts w:ascii="Times New Roman" w:hAnsi="Times New Roman" w:cs="Times New Roman"/>
-        </w:rPr>
-      </w:pPr>
-      <w:r>
-        <w:rPr>
-          <w:rFonts w:ascii="Times New Roman" w:hAnsi="Times New Roman" w:cs="Times New Roman"/>
-        </w:rPr>
-        <w:t>No model can reliably tell you where Bitcoin goes tomorrow. But that does not mean every day is equally attractive for accumulation. The real value, we found, lies in identifying which market environments offer better windows for long-term buying.</w:t>
-      </w:r>
-      <w:r>
-        <w:rPr>
-          <w:rFonts w:ascii="Times New Roman" w:hAnsi="Times New Roman" w:cs="Times New Roman" w:hint="eastAsia"/>
-        </w:rPr>
-        <w:t xml:space="preserve"> </w:t>
-      </w:r>
-      <w:r>
-        <w:rPr>
-          <w:rFonts w:ascii="Times New Roman" w:hAnsi="Times New Roman" w:cs="Times New Roman"/>
-        </w:rPr>
-        <w:t>From our analysis, four signal groups stood out.</w:t>
-      </w:r>
-    </w:p>
-    <w:p>
-      <w:pPr>
-        <w:pStyle w:val="3"/>
-        <w:rPr>
-          <w:rFonts w:ascii="Times New Roman" w:hAnsi="Times New Roman" w:cs="Times New Roman"/>
-        </w:rPr>
-      </w:pPr>
-      <w:r>
-        <w:rPr>
-          <w:rFonts w:ascii="Times New Roman" w:hAnsi="Times New Roman" w:cs="Times New Roman"/>
-        </w:rPr>
-        <w:t>1) The strongest signal is still on-chain: undervaluation plus participation</w:t>
-      </w:r>
-    </w:p>
-    <w:p>
-      <w:pPr>
-        <w:pStyle w:val="ac"/>
-        <w:rPr>
-          <w:rFonts w:ascii="Times New Roman" w:hAnsi="Times New Roman" w:cs="Times New Roman"/>
-        </w:rPr>
-      </w:pPr>
-      <w:r>
-        <w:rPr>
-          <w:rFonts w:ascii="Times New Roman" w:hAnsi="Times New Roman" w:cs="Times New Roman"/>
-          <w:noProof/>
-        </w:rPr>
         <w:drawing>
-          <wp:inline distT="0" distB="0" distL="0" distR="0" wp14:anchorId="2A4CC24C" wp14:editId="5278035A">
-            <wp:extent cx="3754470" cy="2647784"/>
-            <wp:effectExtent l="0" t="0" r="5080" b="0"/>
+          <wp:inline distT="0" distB="0" distL="0" distR="0" wp14:anchorId="2A4CC24C" wp14:editId="1BD74E96">
+            <wp:extent cx="4285753" cy="3022464"/>
+            <wp:effectExtent l="0" t="0" r="0" b="0"/>
             <wp:docPr id="571010460" name="图片 2" descr="图表, 树状图&#10;&#10;描述已自动生成"/>
             <wp:cNvGraphicFramePr>
               <a:graphicFrameLocks xmlns:a="http://schemas.openxmlformats.org/drawingml/2006/main" noChangeAspect="1"/>
@@ -230,7 +214,7 @@
                   <pic:spPr>
                     <a:xfrm>
                       <a:off x="0" y="0"/>
-                      <a:ext cx="3767563" cy="2657018"/>
+                      <a:ext cx="4308190" cy="3038288"/>
                     </a:xfrm>
                     <a:prstGeom prst="rect">
                       <a:avLst/>
@@ -319,7 +303,7 @@
       <w:pPr>
         <w:pStyle w:val="ac"/>
         <w:rPr>
-          <w:rFonts w:ascii="Times New Roman" w:hAnsi="Times New Roman" w:cs="Times New Roman" w:hint="eastAsia"/>
+          <w:rFonts w:ascii="Times New Roman" w:hAnsi="Times New Roman" w:cs="Times New Roman"/>
         </w:rPr>
       </w:pPr>
       <w:r>
@@ -793,7 +777,7 @@
       <w:pPr>
         <w:pStyle w:val="ac"/>
         <w:rPr>
-          <w:rFonts w:ascii="Times New Roman" w:hAnsi="Times New Roman" w:cs="Times New Roman"/>
+          <w:rFonts w:ascii="Times New Roman" w:hAnsi="Times New Roman" w:cs="Times New Roman" w:hint="eastAsia"/>
         </w:rPr>
       </w:pPr>
       <w:r>
@@ -814,22 +798,6 @@
           <w:rFonts w:ascii="Times New Roman" w:hAnsi="Times New Roman" w:cs="Times New Roman"/>
         </w:rPr>
         <w:t xml:space="preserve"> than a primary driver. It is useful for reading the temperature of the market, but not for steering the entire strategy on its own.</w:t>
-      </w:r>
-    </w:p>
-    <w:p>
-      <w:pPr>
-        <w:rPr>
-          <w:rFonts w:ascii="Times New Roman" w:hAnsi="Times New Roman" w:cs="Times New Roman"/>
-        </w:rPr>
-      </w:pPr>
-      <w:r>
-        <w:rPr>
-          <w:rFonts w:ascii="Times New Roman" w:hAnsi="Times New Roman" w:cs="Times New Roman"/>
-          <w:noProof/>
-        </w:rPr>
-        <w:pict w14:anchorId="4DAE1ED4">
-          <v:rect id="_x0000_i1027" alt="" style="width:415.3pt;height:.05pt;mso-width-percent:0;mso-height-percent:0;mso-width-percent:0;mso-height-percent:0" o:hralign="center" o:hrstd="t" o:hr="t" fillcolor="#a0a0a0" stroked="f"/>
-        </w:pict>
       </w:r>
     </w:p>
     <w:p>
@@ -1087,6 +1055,20 @@
       <w:pPr>
         <w:pStyle w:val="ac"/>
         <w:rPr>
+          <w:rFonts w:ascii="Times New Roman" w:hAnsi="Times New Roman" w:cs="Times New Roman" w:hint="eastAsia"/>
+        </w:rPr>
+      </w:pPr>
+      <w:r>
+        <w:rPr>
+          <w:rFonts w:ascii="Times New Roman" w:hAnsi="Times New Roman" w:cs="Times New Roman"/>
+        </w:rPr>
+        <w:t>Not toward some fantasy of perfect timing, but toward a more informed allocation process that still respects the long-term discipline of accumulation.</w:t>
+      </w:r>
+    </w:p>
+    <w:p>
+      <w:pPr>
+        <w:pStyle w:val="2"/>
+        <w:rPr>
           <w:rFonts w:ascii="Times New Roman" w:hAnsi="Times New Roman" w:cs="Times New Roman"/>
         </w:rPr>
       </w:pPr>
@@ -1095,36 +1077,6 @@
           <w:rFonts w:ascii="Times New Roman" w:hAnsi="Times New Roman" w:cs="Times New Roman"/>
         </w:rPr>
         <w:lastRenderedPageBreak/>
-        <w:t>Not toward some fantasy of perfect timing, but toward a more informed allocation process that still respects the long-term discipline of accumulation.</w:t>
-      </w:r>
-    </w:p>
-    <w:p>
-      <w:pPr>
-        <w:rPr>
-          <w:rFonts w:ascii="Times New Roman" w:hAnsi="Times New Roman" w:cs="Times New Roman"/>
-        </w:rPr>
-      </w:pPr>
-      <w:r>
-        <w:rPr>
-          <w:rFonts w:ascii="Times New Roman" w:hAnsi="Times New Roman" w:cs="Times New Roman"/>
-          <w:noProof/>
-        </w:rPr>
-        <w:pict w14:anchorId="1C6F6C8C">
-          <v:rect id="_x0000_i1026" alt="" style="width:415.3pt;height:.05pt;mso-width-percent:0;mso-height-percent:0;mso-width-percent:0;mso-height-percent:0" o:hralign="center" o:hrstd="t" o:hr="t" fillcolor="#a0a0a0" stroked="f"/>
-        </w:pict>
-      </w:r>
-    </w:p>
-    <w:p>
-      <w:pPr>
-        <w:pStyle w:val="2"/>
-        <w:rPr>
-          <w:rFonts w:ascii="Times New Roman" w:hAnsi="Times New Roman" w:cs="Times New Roman"/>
-        </w:rPr>
-      </w:pPr>
-      <w:r>
-        <w:rPr>
-          <w:rFonts w:ascii="Times New Roman" w:hAnsi="Times New Roman" w:cs="Times New Roman"/>
-        </w:rPr>
         <w:t>Limitations matter</w:t>
       </w:r>
     </w:p>
@@ -1230,7 +1182,7 @@
       <w:pPr>
         <w:pStyle w:val="ac"/>
         <w:rPr>
-          <w:rFonts w:ascii="Times New Roman" w:hAnsi="Times New Roman" w:cs="Times New Roman"/>
+          <w:rFonts w:ascii="Times New Roman" w:hAnsi="Times New Roman" w:cs="Times New Roman" w:hint="eastAsia"/>
         </w:rPr>
       </w:pPr>
       <w:r>
@@ -1238,22 +1190,6 @@
           <w:rFonts w:ascii="Times New Roman" w:hAnsi="Times New Roman" w:cs="Times New Roman"/>
         </w:rPr>
         <w:t>For that reason, I see this project more as a solid research starting point than as a fully settled endpoint.</w:t>
-      </w:r>
-    </w:p>
-    <w:p>
-      <w:pPr>
-        <w:rPr>
-          <w:rFonts w:ascii="Times New Roman" w:hAnsi="Times New Roman" w:cs="Times New Roman"/>
-        </w:rPr>
-      </w:pPr>
-      <w:r>
-        <w:rPr>
-          <w:rFonts w:ascii="Times New Roman" w:hAnsi="Times New Roman" w:cs="Times New Roman"/>
-          <w:noProof/>
-        </w:rPr>
-        <w:pict w14:anchorId="4DA62BF6">
-          <v:rect id="_x0000_i1025" alt="" style="width:415.3pt;height:.05pt;mso-width-percent:0;mso-height-percent:0;mso-width-percent:0;mso-height-percent:0" o:hralign="center" o:hrstd="t" o:hr="t" fillcolor="#a0a0a0" stroked="f"/>
-        </w:pict>
       </w:r>
     </w:p>
     <w:p>

</xml_diff>